<commit_message>
Kleisthenes: Wiederholung als Fehler-Übersicht zu Herrschaftsformen und Protagonisten (Folien 3–4, Handreichung)
Co-Authored-By: Claude Opus 5.5 <noreply@anthropic.com>
Claude-Session: https://claude.ai/code/session_013iN4Tiarea1J9YUJHZ9iqC
</commit_message>
<xml_diff>
--- a/Geschichte_11/Stunde_Kleisthenes/Handreichung_Kleisthenes.docx
+++ b/Geschichte_11/Stunde_Kleisthenes/Handreichung_Kleisthenes.docx
@@ -171,7 +171,7 @@
           <w:sz w:val="19"/>
           <w:szCs w:val="19"/>
         </w:rPr>
-        <w:t xml:space="preserve"> Die Leitfrage „Ein Tyrann als Wegbereiter?“ wurde nicht mehr geschafft, und der Abruf aus dem Gedächtnis fehlte – beides steht am Anfang. Vorstellen läuft vom Platz aus, du trägst ein (Rückmeldung Peisistratos).</w:t>
+        <w:t xml:space="preserve"> Die Leitfrage „Ein Tyrann als Wegbereiter?“ wurde nicht mehr geschafft, und der Abruf aus dem Gedächtnis fehlte – beides steht am Anfang (Fehler-Übersicht zur ganzen Reihe, Wunsch der Lehrkraft). Vorstellen läuft vom Platz aus, du trägst ein (Rückmeldung Peisistratos).</w:t>
       </w:r>
     </w:p>
     <w:p>
@@ -996,7 +996,7 @@
           <w:sz w:val="19"/>
           <w:szCs w:val="19"/>
         </w:rPr>
-        <w:t xml:space="preserve">☐  Seitentafel: Ziel und Ablauf (wie Folie 2). Daneben das leere Peisistratos-Gerüst (Mitte, vier Felder, Pfeile hin und zurück).</w:t>
+        <w:t xml:space="preserve">☐  Seitentafel: Ziel und Ablauf (wie Folie 2).</w:t>
       </w:r>
     </w:p>
     <w:p>
@@ -1537,7 +1537,7 @@
                 <w:sz w:val="16"/>
                 <w:szCs w:val="16"/>
               </w:rPr>
-              <w:t xml:space="preserve">Peisistratos-Gerüst an der Tafel: allein ein Stichwort pro Feld ins Heft (2), Partnercheck (1), Stichproben bei 4 Schülern, du trägst ein (2).</w:t>
+              <w:t xml:space="preserve">Fehler-Übersicht zu Herrschaftsformen und Protagonisten (Aristokratie, Drakon, Solon, Peisistratos): allein 6 Fehler finden und im Heft berichtigen (2), Partnercheck (1), Stichproben bei 4–6 Schülern (2).</w:t>
             </w:r>
           </w:p>
         </w:tc>
@@ -1566,7 +1566,7 @@
                 <w:sz w:val="16"/>
                 <w:szCs w:val="16"/>
               </w:rPr>
-              <w:t xml:space="preserve">Abruf aus dem Gedächtnis (fehlte letzte Stunde); die Idee „Adel schwächen“ wird gebraucht (direkt).</w:t>
+              <w:t xml:space="preserve">Abruf aus dem Gedächtnis über die ganze Reihe (Klausur!) und Fehleranalyse statt Abfrage (direkt).</w:t>
             </w:r>
           </w:p>
         </w:tc>
@@ -1697,7 +1697,7 @@
                 <w:sz w:val="16"/>
                 <w:szCs w:val="16"/>
               </w:rPr>
-              <w:t xml:space="preserve"> Leitfrage nachholen</w:t>
+              <w:t xml:space="preserve"> Lösung + Leitfrage</w:t>
             </w:r>
           </w:p>
         </w:tc>
@@ -1726,7 +1726,7 @@
                 <w:sz w:val="16"/>
                 <w:szCs w:val="16"/>
               </w:rPr>
-              <w:t xml:space="preserve">„Peisistratos – Wegbereiter der Demokratie?“ Zwei Schüler antworten in einem Satz, dann Lösungsfolie mit dem „Aber“.</w:t>
+              <w:t xml:space="preserve">Lösungsfolie, Fehler grün verbessern. Dann die offene Leitfrage „Peisistratos – Wegbereiter der Demokratie?“: zwei Schüler antworten in einem Satz, danach der Satz unten auf der Folie.</w:t>
             </w:r>
           </w:p>
         </w:tc>
@@ -1755,7 +1755,7 @@
                 <w:sz w:val="16"/>
                 <w:szCs w:val="16"/>
               </w:rPr>
-              <w:t xml:space="preserve">Offene Frage der letzten Stunde schließen; das „Aber“ ist die Gelenkstelle zu heute.</w:t>
+              <w:t xml:space="preserve">Offene Frage der letzten Stunde schließen; das „Aber“ (Adel bestimmt weiter über seine Anhänger) ist die Gelenkstelle zu heute.</w:t>
             </w:r>
           </w:p>
         </w:tc>
@@ -1784,7 +1784,7 @@
                 <w:sz w:val="16"/>
                 <w:szCs w:val="16"/>
               </w:rPr>
-              <w:t xml:space="preserve">Stichproben</w:t>
+              <w:t xml:space="preserve">EA, Stichproben</w:t>
             </w:r>
           </w:p>
         </w:tc>
@@ -3479,7 +3479,717 @@
           <w:sz w:val="25"/>
           <w:szCs w:val="25"/>
         </w:rPr>
-        <w:t xml:space="preserve">4. Erwartungshorizont: die Erklärungskette</w:t>
+        <w:t xml:space="preserve">4. Erwartungshorizont</w:t>
+      </w:r>
+    </w:p>
+    <w:p>
+      <w:pPr>
+        <w:keepNext/>
+        <w:spacing w:after="80" w:before="0"/>
+      </w:pPr>
+      <w:r>
+        <w:rPr>
+          <w:b/>
+          <w:bCs/>
+          <w:sz w:val="18"/>
+          <w:szCs w:val="18"/>
+        </w:rPr>
+        <w:t xml:space="preserve">Fehler-Übersicht (Folie 3) – die 6 Fehler:</w:t>
+      </w:r>
+    </w:p>
+    <w:tbl>
+      <w:tblPr>
+        <w:tblW w:type="dxa" w:w="9638"/>
+        <w:tblBorders>
+          <w:top w:val="single" w:color="auto" w:sz="4"/>
+          <w:left w:val="single" w:color="auto" w:sz="4"/>
+          <w:bottom w:val="single" w:color="auto" w:sz="4"/>
+          <w:right w:val="single" w:color="auto" w:sz="4"/>
+          <w:insideH w:val="single" w:color="auto" w:sz="4"/>
+          <w:insideV w:val="single" w:color="auto" w:sz="4"/>
+        </w:tblBorders>
+      </w:tblPr>
+      <w:tblGrid>
+        <w:gridCol w:w="2400"/>
+        <w:gridCol w:w="3600"/>
+        <w:gridCol w:w="3638"/>
+      </w:tblGrid>
+      <w:tr>
+        <w:trPr>
+          <w:tblHeader/>
+        </w:trPr>
+        <w:tc>
+          <w:tcPr>
+            <w:tcW w:type="dxa" w:w="2400"/>
+            <w:tcBorders>
+              <w:top w:val="single" w:color="BFB5A5" w:sz="4"/>
+              <w:left w:val="single" w:color="BFB5A5" w:sz="4"/>
+              <w:bottom w:val="single" w:color="BFB5A5" w:sz="4"/>
+              <w:right w:val="single" w:color="BFB5A5" w:sz="4"/>
+            </w:tcBorders>
+            <w:shd w:fill="2B2318" w:color="auto" w:val="clear"/>
+            <w:tcMar>
+              <w:top w:type="dxa" w:w="60"/>
+              <w:left w:type="dxa" w:w="90"/>
+              <w:bottom w:type="dxa" w:w="60"/>
+              <w:right w:type="dxa" w:w="90"/>
+            </w:tcMar>
+          </w:tcPr>
+          <w:p>
+            <w:pPr>
+              <w:spacing w:after="0" w:before="0"/>
+            </w:pPr>
+            <w:r>
+              <w:rPr>
+                <w:b/>
+                <w:bCs/>
+                <w:color w:val="FFFFFF"/>
+                <w:sz w:val="17"/>
+                <w:szCs w:val="17"/>
+              </w:rPr>
+              <w:t xml:space="preserve">Protagonist</w:t>
+            </w:r>
+          </w:p>
+        </w:tc>
+        <w:tc>
+          <w:tcPr>
+            <w:tcW w:type="dxa" w:w="3600"/>
+            <w:tcBorders>
+              <w:top w:val="single" w:color="BFB5A5" w:sz="4"/>
+              <w:left w:val="single" w:color="BFB5A5" w:sz="4"/>
+              <w:bottom w:val="single" w:color="BFB5A5" w:sz="4"/>
+              <w:right w:val="single" w:color="BFB5A5" w:sz="4"/>
+            </w:tcBorders>
+            <w:shd w:fill="2B2318" w:color="auto" w:val="clear"/>
+            <w:tcMar>
+              <w:top w:type="dxa" w:w="60"/>
+              <w:left w:type="dxa" w:w="90"/>
+              <w:bottom w:type="dxa" w:w="60"/>
+              <w:right w:type="dxa" w:w="90"/>
+            </w:tcMar>
+          </w:tcPr>
+          <w:p>
+            <w:pPr>
+              <w:spacing w:after="0" w:before="0"/>
+            </w:pPr>
+            <w:r>
+              <w:rPr>
+                <w:b/>
+                <w:bCs/>
+                <w:color w:val="FFFFFF"/>
+                <w:sz w:val="17"/>
+                <w:szCs w:val="17"/>
+              </w:rPr>
+              <w:t xml:space="preserve">Falsch</w:t>
+            </w:r>
+          </w:p>
+        </w:tc>
+        <w:tc>
+          <w:tcPr>
+            <w:tcW w:type="dxa" w:w="3638"/>
+            <w:tcBorders>
+              <w:top w:val="single" w:color="BFB5A5" w:sz="4"/>
+              <w:left w:val="single" w:color="BFB5A5" w:sz="4"/>
+              <w:bottom w:val="single" w:color="BFB5A5" w:sz="4"/>
+              <w:right w:val="single" w:color="BFB5A5" w:sz="4"/>
+            </w:tcBorders>
+            <w:shd w:fill="2B2318" w:color="auto" w:val="clear"/>
+            <w:tcMar>
+              <w:top w:type="dxa" w:w="60"/>
+              <w:left w:type="dxa" w:w="90"/>
+              <w:bottom w:type="dxa" w:w="60"/>
+              <w:right w:type="dxa" w:w="90"/>
+            </w:tcMar>
+          </w:tcPr>
+          <w:p>
+            <w:pPr>
+              <w:spacing w:after="0" w:before="0"/>
+            </w:pPr>
+            <w:r>
+              <w:rPr>
+                <w:b/>
+                <w:bCs/>
+                <w:color w:val="FFFFFF"/>
+                <w:sz w:val="17"/>
+                <w:szCs w:val="17"/>
+              </w:rPr>
+              <w:t xml:space="preserve">Richtig</w:t>
+            </w:r>
+          </w:p>
+        </w:tc>
+      </w:tr>
+      <w:tr>
+        <w:trPr>
+          <w:cantSplit/>
+        </w:trPr>
+        <w:tc>
+          <w:tcPr>
+            <w:tcW w:type="dxa" w:w="2400"/>
+            <w:tcBorders>
+              <w:top w:val="single" w:color="BFB5A5" w:sz="4"/>
+              <w:left w:val="single" w:color="BFB5A5" w:sz="4"/>
+              <w:bottom w:val="single" w:color="BFB5A5" w:sz="4"/>
+              <w:right w:val="single" w:color="BFB5A5" w:sz="4"/>
+            </w:tcBorders>
+            <w:shd w:fill="F4ECDE" w:color="auto" w:val="clear"/>
+            <w:tcMar>
+              <w:top w:type="dxa" w:w="60"/>
+              <w:left w:type="dxa" w:w="90"/>
+              <w:bottom w:type="dxa" w:w="60"/>
+              <w:right w:type="dxa" w:w="90"/>
+            </w:tcMar>
+          </w:tcPr>
+          <w:p>
+            <w:pPr>
+              <w:spacing w:after="30" w:before="0"/>
+            </w:pPr>
+            <w:r>
+              <w:rPr>
+                <w:sz w:val="17"/>
+                <w:szCs w:val="17"/>
+              </w:rPr>
+              <w:t xml:space="preserve">Aristokratie</w:t>
+            </w:r>
+          </w:p>
+        </w:tc>
+        <w:tc>
+          <w:tcPr>
+            <w:tcW w:type="dxa" w:w="3600"/>
+            <w:tcBorders>
+              <w:top w:val="single" w:color="BFB5A5" w:sz="4"/>
+              <w:left w:val="single" w:color="BFB5A5" w:sz="4"/>
+              <w:bottom w:val="single" w:color="BFB5A5" w:sz="4"/>
+              <w:right w:val="single" w:color="BFB5A5" w:sz="4"/>
+            </w:tcBorders>
+            <w:tcMar>
+              <w:top w:type="dxa" w:w="60"/>
+              <w:left w:type="dxa" w:w="90"/>
+              <w:bottom w:type="dxa" w:w="60"/>
+              <w:right w:type="dxa" w:w="90"/>
+            </w:tcMar>
+          </w:tcPr>
+          <w:p>
+            <w:pPr>
+              <w:spacing w:after="30" w:before="0"/>
+            </w:pPr>
+            <w:r>
+              <w:rPr>
+                <w:sz w:val="17"/>
+                <w:szCs w:val="17"/>
+              </w:rPr>
+              <w:t xml:space="preserve">Recht sprechen gewählte Richter aus dem Volk.</w:t>
+            </w:r>
+          </w:p>
+        </w:tc>
+        <w:tc>
+          <w:tcPr>
+            <w:tcW w:type="dxa" w:w="3638"/>
+            <w:tcBorders>
+              <w:top w:val="single" w:color="BFB5A5" w:sz="4"/>
+              <w:left w:val="single" w:color="BFB5A5" w:sz="4"/>
+              <w:bottom w:val="single" w:color="BFB5A5" w:sz="4"/>
+              <w:right w:val="single" w:color="BFB5A5" w:sz="4"/>
+            </w:tcBorders>
+            <w:tcMar>
+              <w:top w:type="dxa" w:w="60"/>
+              <w:left w:type="dxa" w:w="90"/>
+              <w:bottom w:type="dxa" w:w="60"/>
+              <w:right w:type="dxa" w:w="90"/>
+            </w:tcMar>
+          </w:tcPr>
+          <w:p>
+            <w:pPr>
+              <w:spacing w:after="30" w:before="0"/>
+            </w:pPr>
+            <w:r>
+              <w:rPr>
+                <w:sz w:val="17"/>
+                <w:szCs w:val="17"/>
+              </w:rPr>
+              <w:t xml:space="preserve">Recht spricht der Adel; geschriebene Gesetze gibt es nicht.</w:t>
+            </w:r>
+          </w:p>
+        </w:tc>
+      </w:tr>
+      <w:tr>
+        <w:trPr>
+          <w:cantSplit/>
+        </w:trPr>
+        <w:tc>
+          <w:tcPr>
+            <w:tcW w:type="dxa" w:w="2400"/>
+            <w:tcBorders>
+              <w:top w:val="single" w:color="BFB5A5" w:sz="4"/>
+              <w:left w:val="single" w:color="BFB5A5" w:sz="4"/>
+              <w:bottom w:val="single" w:color="BFB5A5" w:sz="4"/>
+              <w:right w:val="single" w:color="BFB5A5" w:sz="4"/>
+            </w:tcBorders>
+            <w:shd w:fill="F4ECDE" w:color="auto" w:val="clear"/>
+            <w:tcMar>
+              <w:top w:type="dxa" w:w="60"/>
+              <w:left w:type="dxa" w:w="90"/>
+              <w:bottom w:type="dxa" w:w="60"/>
+              <w:right w:type="dxa" w:w="90"/>
+            </w:tcMar>
+          </w:tcPr>
+          <w:p>
+            <w:pPr>
+              <w:spacing w:after="30" w:before="0"/>
+            </w:pPr>
+            <w:r>
+              <w:rPr>
+                <w:sz w:val="17"/>
+                <w:szCs w:val="17"/>
+              </w:rPr>
+              <w:t xml:space="preserve">Drakon</w:t>
+            </w:r>
+          </w:p>
+        </w:tc>
+        <w:tc>
+          <w:tcPr>
+            <w:tcW w:type="dxa" w:w="3600"/>
+            <w:tcBorders>
+              <w:top w:val="single" w:color="BFB5A5" w:sz="4"/>
+              <w:left w:val="single" w:color="BFB5A5" w:sz="4"/>
+              <w:bottom w:val="single" w:color="BFB5A5" w:sz="4"/>
+              <w:right w:val="single" w:color="BFB5A5" w:sz="4"/>
+            </w:tcBorders>
+            <w:tcMar>
+              <w:top w:type="dxa" w:w="60"/>
+              <w:left w:type="dxa" w:w="90"/>
+              <w:bottom w:type="dxa" w:w="60"/>
+              <w:right w:type="dxa" w:w="90"/>
+            </w:tcMar>
+          </w:tcPr>
+          <w:p>
+            <w:pPr>
+              <w:spacing w:after="30" w:before="0"/>
+            </w:pPr>
+            <w:r>
+              <w:rPr>
+                <w:sz w:val="17"/>
+                <w:szCs w:val="17"/>
+              </w:rPr>
+              <w:t xml:space="preserve">Er schafft die Schuldknechtschaft ab.</w:t>
+            </w:r>
+          </w:p>
+        </w:tc>
+        <w:tc>
+          <w:tcPr>
+            <w:tcW w:type="dxa" w:w="3638"/>
+            <w:tcBorders>
+              <w:top w:val="single" w:color="BFB5A5" w:sz="4"/>
+              <w:left w:val="single" w:color="BFB5A5" w:sz="4"/>
+              <w:bottom w:val="single" w:color="BFB5A5" w:sz="4"/>
+              <w:right w:val="single" w:color="BFB5A5" w:sz="4"/>
+            </w:tcBorders>
+            <w:tcMar>
+              <w:top w:type="dxa" w:w="60"/>
+              <w:left w:type="dxa" w:w="90"/>
+              <w:bottom w:type="dxa" w:w="60"/>
+              <w:right w:type="dxa" w:w="90"/>
+            </w:tcMar>
+          </w:tcPr>
+          <w:p>
+            <w:pPr>
+              <w:spacing w:after="30" w:before="0"/>
+            </w:pPr>
+            <w:r>
+              <w:rPr>
+                <w:sz w:val="17"/>
+                <w:szCs w:val="17"/>
+              </w:rPr>
+              <w:t xml:space="preserve">Die Schuldknechtschaft bleibt bestehen.</w:t>
+            </w:r>
+          </w:p>
+        </w:tc>
+      </w:tr>
+      <w:tr>
+        <w:trPr>
+          <w:cantSplit/>
+        </w:trPr>
+        <w:tc>
+          <w:tcPr>
+            <w:tcW w:type="dxa" w:w="2400"/>
+            <w:tcBorders>
+              <w:top w:val="single" w:color="BFB5A5" w:sz="4"/>
+              <w:left w:val="single" w:color="BFB5A5" w:sz="4"/>
+              <w:bottom w:val="single" w:color="BFB5A5" w:sz="4"/>
+              <w:right w:val="single" w:color="BFB5A5" w:sz="4"/>
+            </w:tcBorders>
+            <w:shd w:fill="F4ECDE" w:color="auto" w:val="clear"/>
+            <w:tcMar>
+              <w:top w:type="dxa" w:w="60"/>
+              <w:left w:type="dxa" w:w="90"/>
+              <w:bottom w:type="dxa" w:w="60"/>
+              <w:right w:type="dxa" w:w="90"/>
+            </w:tcMar>
+          </w:tcPr>
+          <w:p>
+            <w:pPr>
+              <w:spacing w:after="30" w:before="0"/>
+            </w:pPr>
+            <w:r>
+              <w:rPr>
+                <w:sz w:val="17"/>
+                <w:szCs w:val="17"/>
+              </w:rPr>
+              <w:t xml:space="preserve">Solon</w:t>
+            </w:r>
+          </w:p>
+        </w:tc>
+        <w:tc>
+          <w:tcPr>
+            <w:tcW w:type="dxa" w:w="3600"/>
+            <w:tcBorders>
+              <w:top w:val="single" w:color="BFB5A5" w:sz="4"/>
+              <w:left w:val="single" w:color="BFB5A5" w:sz="4"/>
+              <w:bottom w:val="single" w:color="BFB5A5" w:sz="4"/>
+              <w:right w:val="single" w:color="BFB5A5" w:sz="4"/>
+            </w:tcBorders>
+            <w:tcMar>
+              <w:top w:type="dxa" w:w="60"/>
+              <w:left w:type="dxa" w:w="90"/>
+              <w:bottom w:type="dxa" w:w="60"/>
+              <w:right w:type="dxa" w:w="90"/>
+            </w:tcMar>
+          </w:tcPr>
+          <w:p>
+            <w:pPr>
+              <w:spacing w:after="30" w:before="0"/>
+            </w:pPr>
+            <w:r>
+              <w:rPr>
+                <w:sz w:val="17"/>
+                <w:szCs w:val="17"/>
+              </w:rPr>
+              <w:t xml:space="preserve">… und verteilt das Land der Großgrundbesitzer neu.</w:t>
+            </w:r>
+          </w:p>
+        </w:tc>
+        <w:tc>
+          <w:tcPr>
+            <w:tcW w:type="dxa" w:w="3638"/>
+            <w:tcBorders>
+              <w:top w:val="single" w:color="BFB5A5" w:sz="4"/>
+              <w:left w:val="single" w:color="BFB5A5" w:sz="4"/>
+              <w:bottom w:val="single" w:color="BFB5A5" w:sz="4"/>
+              <w:right w:val="single" w:color="BFB5A5" w:sz="4"/>
+            </w:tcBorders>
+            <w:tcMar>
+              <w:top w:type="dxa" w:w="60"/>
+              <w:left w:type="dxa" w:w="90"/>
+              <w:bottom w:type="dxa" w:w="60"/>
+              <w:right w:type="dxa" w:w="90"/>
+            </w:tcMar>
+          </w:tcPr>
+          <w:p>
+            <w:pPr>
+              <w:spacing w:after="30" w:before="0"/>
+            </w:pPr>
+            <w:r>
+              <w:rPr>
+                <w:sz w:val="17"/>
+                <w:szCs w:val="17"/>
+              </w:rPr>
+              <w:t xml:space="preserve">Schulden gestrichen, aber keine Landverteilung.</w:t>
+            </w:r>
+          </w:p>
+        </w:tc>
+      </w:tr>
+      <w:tr>
+        <w:trPr>
+          <w:cantSplit/>
+        </w:trPr>
+        <w:tc>
+          <w:tcPr>
+            <w:tcW w:type="dxa" w:w="2400"/>
+            <w:tcBorders>
+              <w:top w:val="single" w:color="BFB5A5" w:sz="4"/>
+              <w:left w:val="single" w:color="BFB5A5" w:sz="4"/>
+              <w:bottom w:val="single" w:color="BFB5A5" w:sz="4"/>
+              <w:right w:val="single" w:color="BFB5A5" w:sz="4"/>
+            </w:tcBorders>
+            <w:shd w:fill="F4ECDE" w:color="auto" w:val="clear"/>
+            <w:tcMar>
+              <w:top w:type="dxa" w:w="60"/>
+              <w:left w:type="dxa" w:w="90"/>
+              <w:bottom w:type="dxa" w:w="60"/>
+              <w:right w:type="dxa" w:w="90"/>
+            </w:tcMar>
+          </w:tcPr>
+          <w:p>
+            <w:pPr>
+              <w:spacing w:after="30" w:before="0"/>
+            </w:pPr>
+            <w:r>
+              <w:rPr>
+                <w:sz w:val="17"/>
+                <w:szCs w:val="17"/>
+              </w:rPr>
+              <w:t xml:space="preserve">Solon</w:t>
+            </w:r>
+          </w:p>
+        </w:tc>
+        <w:tc>
+          <w:tcPr>
+            <w:tcW w:type="dxa" w:w="3600"/>
+            <w:tcBorders>
+              <w:top w:val="single" w:color="BFB5A5" w:sz="4"/>
+              <w:left w:val="single" w:color="BFB5A5" w:sz="4"/>
+              <w:bottom w:val="single" w:color="BFB5A5" w:sz="4"/>
+              <w:right w:val="single" w:color="BFB5A5" w:sz="4"/>
+            </w:tcBorders>
+            <w:tcMar>
+              <w:top w:type="dxa" w:w="60"/>
+              <w:left w:type="dxa" w:w="90"/>
+              <w:bottom w:type="dxa" w:w="60"/>
+              <w:right w:type="dxa" w:w="90"/>
+            </w:tcMar>
+          </w:tcPr>
+          <w:p>
+            <w:pPr>
+              <w:spacing w:after="30" w:before="0"/>
+            </w:pPr>
+            <w:r>
+              <w:rPr>
+                <w:sz w:val="17"/>
+                <w:szCs w:val="17"/>
+              </w:rPr>
+              <w:t xml:space="preserve">Rechte nach der Herkunft; Theten dürfen Archont werden.</w:t>
+            </w:r>
+          </w:p>
+        </w:tc>
+        <w:tc>
+          <w:tcPr>
+            <w:tcW w:type="dxa" w:w="3638"/>
+            <w:tcBorders>
+              <w:top w:val="single" w:color="BFB5A5" w:sz="4"/>
+              <w:left w:val="single" w:color="BFB5A5" w:sz="4"/>
+              <w:bottom w:val="single" w:color="BFB5A5" w:sz="4"/>
+              <w:right w:val="single" w:color="BFB5A5" w:sz="4"/>
+            </w:tcBorders>
+            <w:tcMar>
+              <w:top w:type="dxa" w:w="60"/>
+              <w:left w:type="dxa" w:w="90"/>
+              <w:bottom w:type="dxa" w:w="60"/>
+              <w:right w:type="dxa" w:w="90"/>
+            </w:tcMar>
+          </w:tcPr>
+          <w:p>
+            <w:pPr>
+              <w:spacing w:after="30" w:before="0"/>
+            </w:pPr>
+            <w:r>
+              <w:rPr>
+                <w:sz w:val="17"/>
+                <w:szCs w:val="17"/>
+              </w:rPr>
+              <w:t xml:space="preserve">Rechte nach dem Besitz; Theten nur abstimmen und klagen.</w:t>
+            </w:r>
+          </w:p>
+        </w:tc>
+      </w:tr>
+      <w:tr>
+        <w:trPr>
+          <w:cantSplit/>
+        </w:trPr>
+        <w:tc>
+          <w:tcPr>
+            <w:tcW w:type="dxa" w:w="2400"/>
+            <w:tcBorders>
+              <w:top w:val="single" w:color="BFB5A5" w:sz="4"/>
+              <w:left w:val="single" w:color="BFB5A5" w:sz="4"/>
+              <w:bottom w:val="single" w:color="BFB5A5" w:sz="4"/>
+              <w:right w:val="single" w:color="BFB5A5" w:sz="4"/>
+            </w:tcBorders>
+            <w:shd w:fill="F4ECDE" w:color="auto" w:val="clear"/>
+            <w:tcMar>
+              <w:top w:type="dxa" w:w="60"/>
+              <w:left w:type="dxa" w:w="90"/>
+              <w:bottom w:type="dxa" w:w="60"/>
+              <w:right w:type="dxa" w:w="90"/>
+            </w:tcMar>
+          </w:tcPr>
+          <w:p>
+            <w:pPr>
+              <w:spacing w:after="30" w:before="0"/>
+            </w:pPr>
+            <w:r>
+              <w:rPr>
+                <w:sz w:val="17"/>
+                <w:szCs w:val="17"/>
+              </w:rPr>
+              <w:t xml:space="preserve">Peisistratos</w:t>
+            </w:r>
+          </w:p>
+        </w:tc>
+        <w:tc>
+          <w:tcPr>
+            <w:tcW w:type="dxa" w:w="3600"/>
+            <w:tcBorders>
+              <w:top w:val="single" w:color="BFB5A5" w:sz="4"/>
+              <w:left w:val="single" w:color="BFB5A5" w:sz="4"/>
+              <w:bottom w:val="single" w:color="BFB5A5" w:sz="4"/>
+              <w:right w:val="single" w:color="BFB5A5" w:sz="4"/>
+            </w:tcBorders>
+            <w:tcMar>
+              <w:top w:type="dxa" w:w="60"/>
+              <w:left w:type="dxa" w:w="90"/>
+              <w:bottom w:type="dxa" w:w="60"/>
+              <w:right w:type="dxa" w:w="90"/>
+            </w:tcMar>
+          </w:tcPr>
+          <w:p>
+            <w:pPr>
+              <w:spacing w:after="30" w:before="0"/>
+            </w:pPr>
+            <w:r>
+              <w:rPr>
+                <w:sz w:val="17"/>
+                <w:szCs w:val="17"/>
+              </w:rPr>
+              <w:t xml:space="preserve">Die Volksversammlung wählt ihn.</w:t>
+            </w:r>
+          </w:p>
+        </w:tc>
+        <w:tc>
+          <w:tcPr>
+            <w:tcW w:type="dxa" w:w="3638"/>
+            <w:tcBorders>
+              <w:top w:val="single" w:color="BFB5A5" w:sz="4"/>
+              <w:left w:val="single" w:color="BFB5A5" w:sz="4"/>
+              <w:bottom w:val="single" w:color="BFB5A5" w:sz="4"/>
+              <w:right w:val="single" w:color="BFB5A5" w:sz="4"/>
+            </w:tcBorders>
+            <w:tcMar>
+              <w:top w:type="dxa" w:w="60"/>
+              <w:left w:type="dxa" w:w="90"/>
+              <w:bottom w:type="dxa" w:w="60"/>
+              <w:right w:type="dxa" w:w="90"/>
+            </w:tcMar>
+          </w:tcPr>
+          <w:p>
+            <w:pPr>
+              <w:spacing w:after="30" w:before="0"/>
+            </w:pPr>
+            <w:r>
+              <w:rPr>
+                <w:sz w:val="17"/>
+                <w:szCs w:val="17"/>
+              </w:rPr>
+              <w:t xml:space="preserve">Er erobert die Macht mit Söldnern, besetzt die Akropolis (546).</w:t>
+            </w:r>
+          </w:p>
+        </w:tc>
+      </w:tr>
+      <w:tr>
+        <w:trPr>
+          <w:cantSplit/>
+        </w:trPr>
+        <w:tc>
+          <w:tcPr>
+            <w:tcW w:type="dxa" w:w="2400"/>
+            <w:tcBorders>
+              <w:top w:val="single" w:color="BFB5A5" w:sz="4"/>
+              <w:left w:val="single" w:color="BFB5A5" w:sz="4"/>
+              <w:bottom w:val="single" w:color="BFB5A5" w:sz="4"/>
+              <w:right w:val="single" w:color="BFB5A5" w:sz="4"/>
+            </w:tcBorders>
+            <w:shd w:fill="F4ECDE" w:color="auto" w:val="clear"/>
+            <w:tcMar>
+              <w:top w:type="dxa" w:w="60"/>
+              <w:left w:type="dxa" w:w="90"/>
+              <w:bottom w:type="dxa" w:w="60"/>
+              <w:right w:type="dxa" w:w="90"/>
+            </w:tcMar>
+          </w:tcPr>
+          <w:p>
+            <w:pPr>
+              <w:spacing w:after="30" w:before="0"/>
+            </w:pPr>
+            <w:r>
+              <w:rPr>
+                <w:sz w:val="17"/>
+                <w:szCs w:val="17"/>
+              </w:rPr>
+              <w:t xml:space="preserve">Peisistratos</w:t>
+            </w:r>
+          </w:p>
+        </w:tc>
+        <w:tc>
+          <w:tcPr>
+            <w:tcW w:type="dxa" w:w="3600"/>
+            <w:tcBorders>
+              <w:top w:val="single" w:color="BFB5A5" w:sz="4"/>
+              <w:left w:val="single" w:color="BFB5A5" w:sz="4"/>
+              <w:bottom w:val="single" w:color="BFB5A5" w:sz="4"/>
+              <w:right w:val="single" w:color="BFB5A5" w:sz="4"/>
+            </w:tcBorders>
+            <w:tcMar>
+              <w:top w:type="dxa" w:w="60"/>
+              <w:left w:type="dxa" w:w="90"/>
+              <w:bottom w:type="dxa" w:w="60"/>
+              <w:right w:type="dxa" w:w="90"/>
+            </w:tcMar>
+          </w:tcPr>
+          <w:p>
+            <w:pPr>
+              <w:spacing w:after="30" w:before="0"/>
+            </w:pPr>
+            <w:r>
+              <w:rPr>
+                <w:sz w:val="17"/>
+                <w:szCs w:val="17"/>
+              </w:rPr>
+              <w:t xml:space="preserve">Er schafft Solons Verfassung ab.</w:t>
+            </w:r>
+          </w:p>
+        </w:tc>
+        <w:tc>
+          <w:tcPr>
+            <w:tcW w:type="dxa" w:w="3638"/>
+            <w:tcBorders>
+              <w:top w:val="single" w:color="BFB5A5" w:sz="4"/>
+              <w:left w:val="single" w:color="BFB5A5" w:sz="4"/>
+              <w:bottom w:val="single" w:color="BFB5A5" w:sz="4"/>
+              <w:right w:val="single" w:color="BFB5A5" w:sz="4"/>
+            </w:tcBorders>
+            <w:tcMar>
+              <w:top w:type="dxa" w:w="60"/>
+              <w:left w:type="dxa" w:w="90"/>
+              <w:bottom w:type="dxa" w:w="60"/>
+              <w:right w:type="dxa" w:w="90"/>
+            </w:tcMar>
+          </w:tcPr>
+          <w:p>
+            <w:pPr>
+              <w:spacing w:after="30" w:before="0"/>
+            </w:pPr>
+            <w:r>
+              <w:rPr>
+                <w:sz w:val="17"/>
+                <w:szCs w:val="17"/>
+              </w:rPr>
+              <w:t xml:space="preserve">Die Verfassung bleibt, die Ämter bekommen seine Anhänger.</w:t>
+            </w:r>
+          </w:p>
+        </w:tc>
+      </w:tr>
+    </w:tbl>
+    <w:p>
+      <w:pPr>
+        <w:keepNext/>
+        <w:spacing w:after="80" w:before="100"/>
+      </w:pPr>
+      <w:r>
+        <w:rPr>
+          <w:b/>
+          <w:bCs/>
+          <w:sz w:val="18"/>
+          <w:szCs w:val="18"/>
+        </w:rPr>
+        <w:t xml:space="preserve">Mystery – die Erklärungskette:</w:t>
       </w:r>
     </w:p>
     <w:tbl>
@@ -4679,14 +5389,14 @@
           <w:sz w:val="18"/>
           <w:szCs w:val="18"/>
         </w:rPr>
-        <w:t xml:space="preserve">Wiederholung (Seitentafel):</w:t>
+        <w:t xml:space="preserve">Hauptfläche:</w:t>
       </w:r>
       <w:r>
         <w:rPr>
           <w:sz w:val="18"/>
           <w:szCs w:val="18"/>
         </w:rPr>
-        <w:t xml:space="preserve"> das leere Peisistratos-Gerüst.</w:t>
+        <w:t xml:space="preserve"> zuerst die Kette Ausgangslage → Wende → Reform → Folge → Ergebnis (Stichworte der Gruppen), dann die Phylen-Skizze:</w:t>
       </w:r>
     </w:p>
     <w:p>
@@ -4697,7 +5407,7 @@
       <w:r>
         <w:drawing>
           <wp:inline distT="0" distB="0" distL="0" distR="0">
-            <wp:extent cx="2476500" cy="2457450"/>
+            <wp:extent cx="4953000" cy="2790825"/>
             <wp:effectExtent t="0" r="0" b="0" l="0"/>
             <wp:docPr id="1" name=""/>
             <wp:cNvGraphicFramePr>
@@ -4714,74 +5424,6 @@
                   </pic:nvPicPr>
                   <pic:blipFill>
                     <a:blip r:embed="rId9" cstate="none"/>
-                    <a:srcRect/>
-                    <a:stretch>
-                      <a:fillRect/>
-                    </a:stretch>
-                  </pic:blipFill>
-                  <pic:spPr bwMode="auto">
-                    <a:xfrm>
-                      <a:off x="0" y="0"/>
-                      <a:ext cx="2476500" cy="2457450"/>
-                    </a:xfrm>
-                    <a:prstGeom prst="rect">
-                      <a:avLst/>
-                    </a:prstGeom>
-                  </pic:spPr>
-                </pic:pic>
-              </a:graphicData>
-            </a:graphic>
-          </wp:inline>
-        </w:drawing>
-      </w:r>
-    </w:p>
-    <w:p>
-      <w:pPr>
-        <w:keepNext/>
-        <w:spacing w:after="80" w:before="0"/>
-      </w:pPr>
-      <w:r>
-        <w:rPr>
-          <w:b/>
-          <w:bCs/>
-          <w:sz w:val="18"/>
-          <w:szCs w:val="18"/>
-        </w:rPr>
-        <w:t xml:space="preserve">Hauptfläche:</w:t>
-      </w:r>
-      <w:r>
-        <w:rPr>
-          <w:sz w:val="18"/>
-          <w:szCs w:val="18"/>
-        </w:rPr>
-        <w:t xml:space="preserve"> zuerst die Kette Ausgangslage → Wende → Reform → Folge → Ergebnis (Stichworte der Gruppen), dann die Phylen-Skizze:</w:t>
-      </w:r>
-    </w:p>
-    <w:p>
-      <w:pPr>
-        <w:spacing w:after="60"/>
-        <w:jc w:val="center"/>
-      </w:pPr>
-      <w:r>
-        <w:drawing>
-          <wp:inline distT="0" distB="0" distL="0" distR="0">
-            <wp:extent cx="4953000" cy="2790825"/>
-            <wp:effectExtent t="0" r="0" b="0" l="0"/>
-            <wp:docPr id="2" name=""/>
-            <wp:cNvGraphicFramePr>
-              <a:graphicFrameLocks xmlns:a="http://schemas.openxmlformats.org/drawingml/2006/main" noChangeAspect="1"/>
-            </wp:cNvGraphicFramePr>
-            <a:graphic xmlns:a="http://schemas.openxmlformats.org/drawingml/2006/main">
-              <a:graphicData uri="http://schemas.openxmlformats.org/drawingml/2006/picture">
-                <pic:pic xmlns:pic="http://schemas.openxmlformats.org/drawingml/2006/picture">
-                  <pic:nvPicPr>
-                    <pic:cNvPr id="0" name="" descr=""/>
-                    <pic:cNvPicPr>
-                      <a:picLocks noChangeAspect="1" noChangeArrowheads="1"/>
-                    </pic:cNvPicPr>
-                  </pic:nvPicPr>
-                  <pic:blipFill>
-                    <a:blip r:embed="rId10" cstate="none"/>
                     <a:srcRect/>
                     <a:stretch>
                       <a:fillRect/>

</xml_diff>

<commit_message>
Kleisthenes: Mystery mit 8 Textabschnitten statt 18 Schnipseln, ohne Ablenker; Folien, Hilfen und Handreichung angepasst
Co-Authored-By: Claude Opus 5.5 <noreply@anthropic.com>
Claude-Session: https://claude.ai/code/session_013iN4Tiarea1J9YUJHZ9iqC
</commit_message>
<xml_diff>
--- a/Geschichte_11/Stunde_Kleisthenes/Handreichung_Kleisthenes.docx
+++ b/Geschichte_11/Stunde_Kleisthenes/Handreichung_Kleisthenes.docx
@@ -474,7 +474,7 @@
                 <w:sz w:val="17"/>
                 <w:szCs w:val="17"/>
               </w:rPr>
-              <w:t xml:space="preserve">neu, aber auf den Schnipseln erklärt</w:t>
+              <w:t xml:space="preserve">neu, aber in den Abschnitten erklärt</w:t>
             </w:r>
           </w:p>
         </w:tc>
@@ -713,7 +713,7 @@
                 <w:sz w:val="17"/>
                 <w:szCs w:val="17"/>
               </w:rPr>
-              <w:t xml:space="preserve">Mystery-Schnipsel</w:t>
+              <w:t xml:space="preserve">Mystery-Abschnitte</w:t>
             </w:r>
           </w:p>
           <w:p>
@@ -783,7 +783,7 @@
                 <w:sz w:val="17"/>
                 <w:szCs w:val="17"/>
               </w:rPr>
-              <w:t xml:space="preserve">Schnipsel sind gemischt nummeriert. Die Gruppen schneiden selbst (oder vorab schneiden und in Umschläge stecken, spart 2 Min.).</w:t>
+              <w:t xml:space="preserve">8 Abschnitte mit Überschrift, gemischt nummeriert. Die Gruppen schneiden selbst (oder vorab schneiden und in Umschläge stecken, spart 2 Min.).</w:t>
             </w:r>
           </w:p>
         </w:tc>
@@ -2322,7 +2322,7 @@
                 <w:sz w:val="16"/>
                 <w:szCs w:val="16"/>
               </w:rPr>
-              <w:t xml:space="preserve">Begriffs-Check: Ohne die Begriffe sind die Schnipsel nicht lesbar (direkt).</w:t>
+              <w:t xml:space="preserve">Begriffs-Check: Ohne die Begriffe sind die Abschnitte nicht lesbar (direkt).</w:t>
             </w:r>
           </w:p>
         </w:tc>
@@ -2482,7 +2482,7 @@
                 <w:sz w:val="16"/>
                 <w:szCs w:val="16"/>
               </w:rPr>
-              <w:t xml:space="preserve">Zwei Schnipsel laut denkend verbinden („aber“), Warnung vor dem Fehler. Gruppen zu dritt bilden, Sets liegen bereit.</w:t>
+              <w:t xml:space="preserve">Zwei Abschnitte laut denkend verbinden („aber“), Warnung vor dem Fehler. Gruppen zu dritt bilden, Sets liegen bereit.</w:t>
             </w:r>
           </w:p>
         </w:tc>
@@ -3438,7 +3438,7 @@
                 <w:sz w:val="18"/>
                 <w:szCs w:val="18"/>
               </w:rPr>
-              <w:t xml:space="preserve">„Ich nehme zwei Schnipsel. Nummer 13 sagt: Seit Solon darf Lysias abstimmen – er hat also das Recht. Nummer 8 sagt: Sein Nachbar hat ihm Saatgut geliehen, seine Familie ist die mächtigste weit und breit. Wie passt das zusammen? Er hat das Recht, aber er ist abhängig. Ich lege die beiden nebeneinander und schreibe ‚aber‘ dazwischen. So baut ihr eure Kette: Was hängt womit zusammen – weil, deshalb, aber?“</w:t>
+              <w:t xml:space="preserve">„Ich nehme zwei Abschnitte. Nummer 4 sagt: Seit Solon darf Lysias abstimmen – er hat also das Recht. Nummer 6 sagt: In den alten Phylen gaben die Adelsfamilien den Ton an, wer zu einer Familie hielt, stimmte mit ihr. Wie passt das zusammen? Er hat das Recht, aber er nutzt es nicht frei. Ich lege die beiden nebeneinander und schreibe ‚aber‘ dazwischen. So baut ihr eure Kette: Was hängt womit zusammen – weil, deshalb, aber?“</w:t>
             </w:r>
           </w:p>
           <w:p>
@@ -4275,7 +4275,7 @@
                 <w:sz w:val="17"/>
                 <w:szCs w:val="17"/>
               </w:rPr>
-              <w:t xml:space="preserve">Schnipsel</w:t>
+              <w:t xml:space="preserve">Abschnitt</w:t>
             </w:r>
           </w:p>
         </w:tc>
@@ -4372,7 +4372,7 @@
                 <w:sz w:val="17"/>
                 <w:szCs w:val="17"/>
               </w:rPr>
-              <w:t xml:space="preserve">2, 5, 8, 13, 18</w:t>
+              <w:t xml:space="preserve">4, 6</w:t>
             </w:r>
           </w:p>
         </w:tc>
@@ -4465,7 +4465,7 @@
                 <w:sz w:val="17"/>
                 <w:szCs w:val="17"/>
               </w:rPr>
-              <w:t xml:space="preserve">4, 10, 16</w:t>
+              <w:t xml:space="preserve">2, 8</w:t>
             </w:r>
           </w:p>
         </w:tc>
@@ -4558,7 +4558,7 @@
                 <w:sz w:val="17"/>
                 <w:szCs w:val="17"/>
               </w:rPr>
-              <w:t xml:space="preserve">7, 15</w:t>
+              <w:t xml:space="preserve">1, 5</w:t>
             </w:r>
           </w:p>
         </w:tc>
@@ -4587,7 +4587,7 @@
                 <w:sz w:val="17"/>
                 <w:szCs w:val="17"/>
               </w:rPr>
-              <w:t xml:space="preserve">Attika wird neu gegliedert: 3 Gebiete × 10 Trittyen, daraus 10 Phylen, die Stadt, Küste und Binnenland mischen.</w:t>
+              <w:t xml:space="preserve">Attika wird neu gegliedert: 3 Gebiete × 10 Trittyen, daraus 10 Phylen, die Stadt, Küste und Binnenland mischen. Bürger ist man über seinen Demos, nicht über seine Familie.</w:t>
             </w:r>
           </w:p>
         </w:tc>
@@ -4651,7 +4651,7 @@
                 <w:sz w:val="17"/>
                 <w:szCs w:val="17"/>
               </w:rPr>
-              <w:t xml:space="preserve">1, 6, 11, 12, 17</w:t>
+              <w:t xml:space="preserve">1, 7</w:t>
             </w:r>
           </w:p>
         </w:tc>
@@ -4680,7 +4680,7 @@
                 <w:sz w:val="17"/>
                 <w:szCs w:val="17"/>
               </w:rPr>
-              <w:t xml:space="preserve">Die Gefolgschaft des Adligen wird auf mehrere Phylen verteilt. Lysias sitzt, berät und kämpft mit Fremden zusammen; er gehört zu seinem Demos statt zu einer Familie.</w:t>
+              <w:t xml:space="preserve">Die Gefolgschaft des Adligen wird auf mehrere Phylen verteilt. Lysias sitzt, berät und kämpft mit Fremden zusammen.</w:t>
             </w:r>
           </w:p>
         </w:tc>
@@ -4837,7 +4837,7 @@
                 <w:sz w:val="17"/>
                 <w:szCs w:val="17"/>
               </w:rPr>
-              <w:t xml:space="preserve">9</w:t>
+              <w:t xml:space="preserve">3</w:t>
             </w:r>
           </w:p>
         </w:tc>
@@ -4872,27 +4872,6 @@
         </w:tc>
       </w:tr>
     </w:tbl>
-    <w:p>
-      <w:pPr>
-        <w:spacing w:after="80" w:before="80"/>
-      </w:pPr>
-      <w:r>
-        <w:rPr>
-          <w:b/>
-          <w:bCs/>
-          <w:sz w:val="18"/>
-          <w:szCs w:val="18"/>
-        </w:rPr>
-        <w:t xml:space="preserve">Ablenker:</w:t>
-      </w:r>
-      <w:r>
-        <w:rPr>
-          <w:sz w:val="18"/>
-          <w:szCs w:val="18"/>
-        </w:rPr>
-        <w:t xml:space="preserve"> Schnipsel 3, 14 (Oliven, Großvater in Sikyon) sind wahr, helfen aber nicht. Sie dürfen aussortiert werden – das ist Teil der Methode.</w:t>
-      </w:r>
-    </w:p>
     <w:p>
       <w:pPr>
         <w:spacing w:after="80" w:before="0"/>
@@ -5077,7 +5056,7 @@
                 <w:sz w:val="17"/>
                 <w:szCs w:val="17"/>
               </w:rPr>
-              <w:t xml:space="preserve">„Steht auf einem Schnipsel, dass jemand Land verliert? Was ändert Kleisthenes stattdessen?“</w:t>
+              <w:t xml:space="preserve">„Steht in einem Abschnitt, dass jemand Land verliert? Was ändert Kleisthenes stattdessen?“</w:t>
             </w:r>
           </w:p>
         </w:tc>
@@ -5269,7 +5248,7 @@
                 <w:sz w:val="17"/>
                 <w:szCs w:val="17"/>
               </w:rPr>
-              <w:t xml:space="preserve">„Und was heißt das für Lysias und seinen Nachbarn? Lest 1 und 11.“</w:t>
+              <w:t xml:space="preserve">„Und was heißt das für Lysias und seinen Nachbarn? Lest Abschnitt 1 (letzter Satz) und 7.“</w:t>
             </w:r>
           </w:p>
         </w:tc>
@@ -5357,7 +5336,7 @@
           <w:sz w:val="18"/>
           <w:szCs w:val="18"/>
         </w:rPr>
-        <w:t xml:space="preserve"> Hilfe 1 – in drei Stapel sortieren (Vorher, Wende, Nachher). Hilfe 2 – Schnipsel 18 und 15 vergleichen (alte und neue Phylen). Hilfe 3 – Schnipsel 1 und 11: Wo landen die Anhänger des Nachbarn, mit wem ist Lysias zusammen?</w:t>
+        <w:t xml:space="preserve"> Hilfe 1 – in drei Stapel sortieren (Vorher, Wende, Nachher). Hilfe 2 – Abschnitt 6 und 1 vergleichen (alte und neue Phylen). Hilfe 3 – Abschnitt 1 (letzter Satz) und 7: Wo landen die Anhänger des Nachbarn, mit wem ist Lysias zusammen?</w:t>
       </w:r>
     </w:p>
     <w:p>

</xml_diff>

<commit_message>
Kleisthenes: Wortleiste mit Verbindungswörtern zum Abstreichen; Lösung mit Verbindungswörtern
Co-Authored-By: Claude Opus 5.5 <noreply@anthropic.com>
Claude-Session: https://claude.ai/code/session_013iN4Tiarea1J9YUJHZ9iqC
</commit_message>
<xml_diff>
--- a/Geschichte_11/Stunde_Kleisthenes/Handreichung_Kleisthenes.docx
+++ b/Geschichte_11/Stunde_Kleisthenes/Handreichung_Kleisthenes.docx
@@ -783,7 +783,7 @@
                 <w:sz w:val="17"/>
                 <w:szCs w:val="17"/>
               </w:rPr>
-              <w:t xml:space="preserve">8 Abschnitte mit Überschrift, gemischt nummeriert. Die Gruppen schneiden selbst (oder vorab schneiden und in Umschläge stecken, spart 2 Min.).</w:t>
+              <w:t xml:space="preserve">8 Abschnitte mit Überschrift, gemischt nummeriert; unten 8 Verbindungswörter zum Abstreichen. Die Gruppen schneiden selbst (oder vorab schneiden und in Umschläge stecken, spart 2 Min.).</w:t>
             </w:r>
           </w:p>
         </w:tc>
@@ -4872,6 +4872,155 @@
         </w:tc>
       </w:tr>
     </w:tbl>
+    <w:p>
+      <w:pPr>
+        <w:spacing w:after="80" w:before="80"/>
+      </w:pPr>
+      <w:r>
+        <w:rPr>
+          <w:b/>
+          <w:bCs/>
+          <w:sz w:val="18"/>
+          <w:szCs w:val="18"/>
+        </w:rPr>
+        <w:t xml:space="preserve">Kette mit Verbindungswörtern (eine mögliche Lösung):</w:t>
+      </w:r>
+      <w:r>
+        <w:rPr>
+          <w:sz w:val="18"/>
+          <w:szCs w:val="18"/>
+        </w:rPr>
+        <w:t xml:space="preserve"> [4] – </w:t>
+      </w:r>
+      <w:r>
+        <w:rPr>
+          <w:b/>
+          <w:bCs/>
+          <w:sz w:val="18"/>
+          <w:szCs w:val="18"/>
+        </w:rPr>
+        <w:t xml:space="preserve">aber</w:t>
+      </w:r>
+      <w:r>
+        <w:rPr>
+          <w:sz w:val="18"/>
+          <w:szCs w:val="18"/>
+        </w:rPr>
+        <w:t xml:space="preserve"> [6] – </w:t>
+      </w:r>
+      <w:r>
+        <w:rPr>
+          <w:b/>
+          <w:bCs/>
+          <w:sz w:val="18"/>
+          <w:szCs w:val="18"/>
+        </w:rPr>
+        <w:t xml:space="preserve">Doch dann</w:t>
+      </w:r>
+      <w:r>
+        <w:rPr>
+          <w:sz w:val="18"/>
+          <w:szCs w:val="18"/>
+        </w:rPr>
+        <w:t xml:space="preserve"> [2] – </w:t>
+      </w:r>
+      <w:r>
+        <w:rPr>
+          <w:b/>
+          <w:bCs/>
+          <w:sz w:val="18"/>
+          <w:szCs w:val="18"/>
+        </w:rPr>
+        <w:t xml:space="preserve">Daraufhin</w:t>
+      </w:r>
+      <w:r>
+        <w:rPr>
+          <w:sz w:val="18"/>
+          <w:szCs w:val="18"/>
+        </w:rPr>
+        <w:t xml:space="preserve"> [8] – </w:t>
+      </w:r>
+      <w:r>
+        <w:rPr>
+          <w:b/>
+          <w:bCs/>
+          <w:sz w:val="18"/>
+          <w:szCs w:val="18"/>
+        </w:rPr>
+        <w:t xml:space="preserve">Danach</w:t>
+      </w:r>
+      <w:r>
+        <w:rPr>
+          <w:sz w:val="18"/>
+          <w:szCs w:val="18"/>
+        </w:rPr>
+        <w:t xml:space="preserve"> [5] – </w:t>
+      </w:r>
+      <w:r>
+        <w:rPr>
+          <w:b/>
+          <w:bCs/>
+          <w:sz w:val="18"/>
+          <w:szCs w:val="18"/>
+        </w:rPr>
+        <w:t xml:space="preserve">Daraus</w:t>
+      </w:r>
+      <w:r>
+        <w:rPr>
+          <w:sz w:val="18"/>
+          <w:szCs w:val="18"/>
+        </w:rPr>
+        <w:t xml:space="preserve"> [1] – </w:t>
+      </w:r>
+      <w:r>
+        <w:rPr>
+          <w:b/>
+          <w:bCs/>
+          <w:sz w:val="18"/>
+          <w:szCs w:val="18"/>
+        </w:rPr>
+        <w:t xml:space="preserve">Dadurch</w:t>
+      </w:r>
+      <w:r>
+        <w:rPr>
+          <w:sz w:val="18"/>
+          <w:szCs w:val="18"/>
+        </w:rPr>
+        <w:t xml:space="preserve"> [7] – </w:t>
+      </w:r>
+      <w:r>
+        <w:rPr>
+          <w:b/>
+          <w:bCs/>
+          <w:sz w:val="18"/>
+          <w:szCs w:val="18"/>
+        </w:rPr>
+        <w:t xml:space="preserve">deshalb</w:t>
+      </w:r>
+      <w:r>
+        <w:rPr>
+          <w:sz w:val="18"/>
+          <w:szCs w:val="18"/>
+        </w:rPr>
+        <w:t xml:space="preserve"> Lysias stimmt frei – </w:t>
+      </w:r>
+      <w:r>
+        <w:rPr>
+          <w:b/>
+          <w:bCs/>
+          <w:sz w:val="18"/>
+          <w:szCs w:val="18"/>
+        </w:rPr>
+        <w:t xml:space="preserve">Außerdem</w:t>
+      </w:r>
+      <w:r>
+        <w:rPr>
+          <w:sz w:val="18"/>
+          <w:szCs w:val="18"/>
+        </w:rPr>
+        <w:t xml:space="preserve"> [3]. Andere Verbindungen sind richtig, wenn sie sinnvoll begründen.</w:t>
+      </w:r>
+    </w:p>
     <w:p>
       <w:pPr>
         <w:spacing w:after="80" w:before="0"/>

</xml_diff>

<commit_message>
Kleisthenes: Lösungsblatt mit den Abschnitten in Verbindung
Co-Authored-By: Claude Opus 5.5 <noreply@anthropic.com>
Claude-Session: https://claude.ai/code/session_013iN4Tiarea1J9YUJHZ9iqC
</commit_message>
<xml_diff>
--- a/Geschichte_11/Stunde_Kleisthenes/Handreichung_Kleisthenes.docx
+++ b/Geschichte_11/Stunde_Kleisthenes/Handreichung_Kleisthenes.docx
@@ -890,6 +890,112 @@
                 <w:szCs w:val="17"/>
               </w:rPr>
               <w:t xml:space="preserve">Schneiden, am Pult auslegen.</w:t>
+            </w:r>
+          </w:p>
+        </w:tc>
+      </w:tr>
+      <w:tr>
+        <w:trPr>
+          <w:cantSplit/>
+        </w:trPr>
+        <w:tc>
+          <w:tcPr>
+            <w:tcW w:type="dxa" w:w="2900"/>
+            <w:tcBorders>
+              <w:top w:val="single" w:color="BFB5A5" w:sz="4"/>
+              <w:left w:val="single" w:color="BFB5A5" w:sz="4"/>
+              <w:bottom w:val="single" w:color="BFB5A5" w:sz="4"/>
+              <w:right w:val="single" w:color="BFB5A5" w:sz="4"/>
+            </w:tcBorders>
+            <w:tcMar>
+              <w:top w:type="dxa" w:w="60"/>
+              <w:left w:type="dxa" w:w="90"/>
+              <w:bottom w:type="dxa" w:w="60"/>
+              <w:right w:type="dxa" w:w="90"/>
+            </w:tcMar>
+          </w:tcPr>
+          <w:p>
+            <w:pPr>
+              <w:spacing w:after="30" w:before="0"/>
+            </w:pPr>
+            <w:r>
+              <w:rPr>
+                <w:b/>
+                <w:bCs/>
+                <w:sz w:val="17"/>
+                <w:szCs w:val="17"/>
+              </w:rPr>
+              <w:t xml:space="preserve">Lösung: Abschnitte in Verbindung</w:t>
+            </w:r>
+          </w:p>
+          <w:p>
+            <w:pPr>
+              <w:spacing w:after="30" w:before="0"/>
+            </w:pPr>
+            <w:r>
+              <w:rPr>
+                <w:sz w:val="17"/>
+                <w:szCs w:val="17"/>
+              </w:rPr>
+              <w:t xml:space="preserve">Mystery_Loesung_Verbindungen.docx</w:t>
+            </w:r>
+          </w:p>
+        </w:tc>
+        <w:tc>
+          <w:tcPr>
+            <w:tcW w:type="dxa" w:w="2100"/>
+            <w:tcBorders>
+              <w:top w:val="single" w:color="BFB5A5" w:sz="4"/>
+              <w:left w:val="single" w:color="BFB5A5" w:sz="4"/>
+              <w:bottom w:val="single" w:color="BFB5A5" w:sz="4"/>
+              <w:right w:val="single" w:color="BFB5A5" w:sz="4"/>
+            </w:tcBorders>
+            <w:tcMar>
+              <w:top w:type="dxa" w:w="60"/>
+              <w:left w:type="dxa" w:w="90"/>
+              <w:bottom w:type="dxa" w:w="60"/>
+              <w:right w:type="dxa" w:w="90"/>
+            </w:tcMar>
+          </w:tcPr>
+          <w:p>
+            <w:pPr>
+              <w:spacing w:after="30" w:before="0"/>
+            </w:pPr>
+            <w:r>
+              <w:rPr>
+                <w:sz w:val="17"/>
+                <w:szCs w:val="17"/>
+              </w:rPr>
+              <w:t xml:space="preserve">1 × (Lehrkraft)</w:t>
+            </w:r>
+          </w:p>
+        </w:tc>
+        <w:tc>
+          <w:tcPr>
+            <w:tcW w:type="dxa" w:w="4638"/>
+            <w:tcBorders>
+              <w:top w:val="single" w:color="BFB5A5" w:sz="4"/>
+              <w:left w:val="single" w:color="BFB5A5" w:sz="4"/>
+              <w:bottom w:val="single" w:color="BFB5A5" w:sz="4"/>
+              <w:right w:val="single" w:color="BFB5A5" w:sz="4"/>
+            </w:tcBorders>
+            <w:tcMar>
+              <w:top w:type="dxa" w:w="60"/>
+              <w:left w:type="dxa" w:w="90"/>
+              <w:bottom w:type="dxa" w:w="60"/>
+              <w:right w:type="dxa" w:w="90"/>
+            </w:tcMar>
+          </w:tcPr>
+          <w:p>
+            <w:pPr>
+              <w:spacing w:after="30" w:before="0"/>
+            </w:pPr>
+            <w:r>
+              <w:rPr>
+                <w:sz w:val="17"/>
+                <w:szCs w:val="17"/>
+              </w:rPr>
+              <w:t xml:space="preserve">Am Pult; zum Vergleichen auch projizierbar.</w:t>
             </w:r>
           </w:p>
         </w:tc>

</xml_diff>

<commit_message>
Kleisthenes: Abschnitte mit Lücke am Satzanfang, Verbindungswort ergibt grammatischen Satz; Lösung, Folien, Handreichung angepasst
Co-Authored-By: Claude Opus 5.5 <noreply@anthropic.com>
Claude-Session: https://claude.ai/code/session_013iN4Tiarea1J9YUJHZ9iqC
</commit_message>
<xml_diff>
--- a/Geschichte_11/Stunde_Kleisthenes/Handreichung_Kleisthenes.docx
+++ b/Geschichte_11/Stunde_Kleisthenes/Handreichung_Kleisthenes.docx
@@ -5092,23 +5092,7 @@
           <w:sz w:val="18"/>
           <w:szCs w:val="18"/>
         </w:rPr>
-        <w:t xml:space="preserve"> [7] – </w:t>
-      </w:r>
-      <w:r>
-        <w:rPr>
-          <w:b/>
-          <w:bCs/>
-          <w:sz w:val="18"/>
-          <w:szCs w:val="18"/>
-        </w:rPr>
-        <w:t xml:space="preserve">deshalb</w:t>
-      </w:r>
-      <w:r>
-        <w:rPr>
-          <w:sz w:val="18"/>
-          <w:szCs w:val="18"/>
-        </w:rPr>
-        <w:t xml:space="preserve"> Lysias stimmt frei – </w:t>
+        <w:t xml:space="preserve"> [7] – Lysias stimmt frei – </w:t>
       </w:r>
       <w:r>
         <w:rPr>

</xml_diff>

<commit_message>
Kleisthenes: Folien vollständig auf mindestens 27 pt umgebaut (19 Folien), Handreichung mit neuen Foliennummern
Co-Authored-By: Claude Opus 5.5 <noreply@anthropic.com>
Claude-Session: https://claude.ai/code/session_013iN4Tiarea1J9YUJHZ9iqC
</commit_message>
<xml_diff>
--- a/Geschichte_11/Stunde_Kleisthenes/Handreichung_Kleisthenes.docx
+++ b/Geschichte_11/Stunde_Kleisthenes/Handreichung_Kleisthenes.docx
@@ -337,7 +337,7 @@
                 <w:sz w:val="17"/>
                 <w:szCs w:val="17"/>
               </w:rPr>
-              <w:t xml:space="preserve">bekannt (Lückentext Polis, Solon: Rat der 400 aus vier Phylen) – auf Folie 7 erinnert</w:t>
+              <w:t xml:space="preserve">bekannt (Lückentext Polis, Solon: Rat der 400 aus vier Phylen) – auf Folie 11 erinnert</w:t>
             </w:r>
           </w:p>
         </w:tc>
@@ -1114,7 +1114,7 @@
           <w:sz w:val="19"/>
           <w:szCs w:val="19"/>
         </w:rPr>
-        <w:t xml:space="preserve">☐  Hauptfläche frei lassen für die Erklärungskette (Folie 10) und die Phylen-Skizze (Folie 11).</w:t>
+        <w:t xml:space="preserve">☐  Hauptfläche frei lassen für die Erklärungskette (Folie 15) und die Phylen-Skizze (Folie 16).</w:t>
       </w:r>
     </w:p>
     <w:p>
@@ -1730,7 +1730,7 @@
                 <w:sz w:val="16"/>
                 <w:szCs w:val="16"/>
               </w:rPr>
-              <w:t xml:space="preserve">3</w:t>
+              <w:t xml:space="preserve">3–4</w:t>
             </w:r>
           </w:p>
         </w:tc>
@@ -1919,7 +1919,7 @@
                 <w:sz w:val="16"/>
                 <w:szCs w:val="16"/>
               </w:rPr>
-              <w:t xml:space="preserve">4</w:t>
+              <w:t xml:space="preserve">5–7</w:t>
             </w:r>
           </w:p>
         </w:tc>
@@ -2108,7 +2108,7 @@
                 <w:sz w:val="16"/>
                 <w:szCs w:val="16"/>
               </w:rPr>
-              <w:t xml:space="preserve">5</w:t>
+              <w:t xml:space="preserve">8</w:t>
             </w:r>
           </w:p>
         </w:tc>
@@ -2297,7 +2297,7 @@
                 <w:sz w:val="16"/>
                 <w:szCs w:val="16"/>
               </w:rPr>
-              <w:t xml:space="preserve">6</w:t>
+              <w:t xml:space="preserve">9</w:t>
             </w:r>
           </w:p>
         </w:tc>
@@ -2486,7 +2486,7 @@
                 <w:sz w:val="16"/>
                 <w:szCs w:val="16"/>
               </w:rPr>
-              <w:t xml:space="preserve">7</w:t>
+              <w:t xml:space="preserve">10–11</w:t>
             </w:r>
           </w:p>
         </w:tc>
@@ -2675,7 +2675,7 @@
                 <w:sz w:val="16"/>
                 <w:szCs w:val="16"/>
               </w:rPr>
-              <w:t xml:space="preserve">8</w:t>
+              <w:t xml:space="preserve">12</w:t>
             </w:r>
           </w:p>
         </w:tc>
@@ -2864,7 +2864,7 @@
                 <w:sz w:val="16"/>
                 <w:szCs w:val="16"/>
               </w:rPr>
-              <w:t xml:space="preserve">9</w:t>
+              <w:t xml:space="preserve">13–14</w:t>
             </w:r>
           </w:p>
         </w:tc>
@@ -3053,7 +3053,7 @@
                 <w:sz w:val="16"/>
                 <w:szCs w:val="16"/>
               </w:rPr>
-              <w:t xml:space="preserve">10</w:t>
+              <w:t xml:space="preserve">15</w:t>
             </w:r>
           </w:p>
         </w:tc>
@@ -3242,7 +3242,7 @@
                 <w:sz w:val="16"/>
                 <w:szCs w:val="16"/>
               </w:rPr>
-              <w:t xml:space="preserve">11</w:t>
+              <w:t xml:space="preserve">16</w:t>
             </w:r>
           </w:p>
         </w:tc>
@@ -3440,7 +3440,7 @@
                 <w:sz w:val="16"/>
                 <w:szCs w:val="16"/>
               </w:rPr>
-              <w:t xml:space="preserve">12–13</w:t>
+              <w:t xml:space="preserve">17–19</w:t>
             </w:r>
           </w:p>
         </w:tc>
@@ -3464,7 +3464,7 @@
           <w:sz w:val="18"/>
           <w:szCs w:val="18"/>
         </w:rPr>
-        <w:t xml:space="preserve"> Schaubild (Folie 11) nur zeigen, nicht erklären; Ostrakismos weglassen. </w:t>
+        <w:t xml:space="preserve"> Schaubild (Folie 16) nur zeigen, nicht erklären; Ostrakismos weglassen. </w:t>
       </w:r>
       <w:r>
         <w:rPr>
@@ -3480,7 +3480,7 @@
           <w:sz w:val="18"/>
           <w:szCs w:val="18"/>
         </w:rPr>
-        <w:t xml:space="preserve"> Abschlussaufgabe (Folien 12–13).</w:t>
+        <w:t xml:space="preserve"> Abschlussaufgabe (Folien 17–19).</w:t>
       </w:r>
     </w:p>
     <w:p>
@@ -3497,7 +3497,7 @@
           <w:sz w:val="25"/>
           <w:szCs w:val="25"/>
         </w:rPr>
-        <w:t xml:space="preserve">3. Vormachen (Folie 8) – laut denken</w:t>
+        <w:t xml:space="preserve">3. Vormachen (Folie 12) – laut denken</w:t>
       </w:r>
     </w:p>
     <w:tbl>
@@ -3600,7 +3600,7 @@
           <w:sz w:val="18"/>
           <w:szCs w:val="18"/>
         </w:rPr>
-        <w:t xml:space="preserve">Fehler-Übersicht (Folie 3) – die 6 Fehler:</w:t>
+        <w:t xml:space="preserve">Fehler-Übersicht (Folien 3–4, Lösung 5–6) – die 6 Fehler:</w:t>
       </w:r>
     </w:p>
     <w:tbl>
@@ -4062,7 +4062,7 @@
                 <w:sz w:val="17"/>
                 <w:szCs w:val="17"/>
               </w:rPr>
-              <w:t xml:space="preserve">Rechte nach der Herkunft; Theten dürfen Archont werden.</w:t>
+              <w:t xml:space="preserve">Die Rechte richten sich nach der Herkunft.</w:t>
             </w:r>
           </w:p>
         </w:tc>
@@ -4091,7 +4091,7 @@
                 <w:sz w:val="17"/>
                 <w:szCs w:val="17"/>
               </w:rPr>
-              <w:t xml:space="preserve">Rechte nach dem Besitz; Theten nur abstimmen und klagen.</w:t>
+              <w:t xml:space="preserve">nach dem Besitz (Timokratie); Theten nur abstimmen und klagen.</w:t>
             </w:r>
           </w:p>
         </w:tc>
@@ -5423,7 +5423,7 @@
                 <w:sz w:val="17"/>
                 <w:szCs w:val="17"/>
               </w:rPr>
-              <w:t xml:space="preserve">„Was ist kleiner: dein Dorf oder deine Phyle?“ (Folie 7)</w:t>
+              <w:t xml:space="preserve">„Was ist kleiner: dein Dorf oder deine Phyle?“ (Folie 10–11)</w:t>
             </w:r>
           </w:p>
         </w:tc>

</xml_diff>